<commit_message>
docs: add hf repo link to ktr
</commit_message>
<xml_diff>
--- a/ktr_v6.docx
+++ b/ktr_v6.docx
@@ -889,7 +889,7 @@
           <w:szCs w:val="24"/>
         </w:rPr>
         <w:drawing>
-          <wp:anchor distT="0" distB="0" distL="114300" distR="114300" simplePos="0" relativeHeight="251669504" behindDoc="0" locked="0" layoutInCell="1" allowOverlap="1" wp14:anchorId="7A82605E" wp14:editId="564B5C20">
+          <wp:anchor distT="0" distB="0" distL="114300" distR="114300" simplePos="0" relativeHeight="251669504" behindDoc="0" locked="0" layoutInCell="1" allowOverlap="1" wp14:anchorId="7A82605E" wp14:editId="26310077">
             <wp:simplePos x="0" y="0"/>
             <wp:positionH relativeFrom="margin">
               <wp:align>center</wp:align>
@@ -951,9 +951,9 @@
         </w:rPr>
         <w:br w:type="page"/>
       </w:r>
-      <w:bookmarkStart w:id="2" w:name="_Toc156208188"/>
+      <w:bookmarkStart w:id="1" w:name="_Toc156208188"/>
     </w:p>
-    <w:bookmarkEnd w:id="2" w:displacedByCustomXml="next"/>
+    <w:bookmarkEnd w:id="1" w:displacedByCustomXml="next"/>
     <w:sdt>
       <w:sdtPr>
         <w:rPr>
@@ -1700,7 +1700,7 @@
       <w:pPr>
         <w:pStyle w:val="Heading1"/>
       </w:pPr>
-      <w:bookmarkStart w:id="3" w:name="_Toc231484143"/>
+      <w:bookmarkStart w:id="2" w:name="_Toc231484143"/>
       <w:r>
         <w:lastRenderedPageBreak/>
         <w:t>PROJE ÖZETİ</w:t>
@@ -1708,10 +1708,10 @@
       <w:r>
         <w:t xml:space="preserve"> </w:t>
       </w:r>
-      <w:bookmarkEnd w:id="3"/>
+      <w:bookmarkEnd w:id="2"/>
     </w:p>
     <w:p>
-      <w:bookmarkStart w:id="4" w:name="_Toc231484144"/>
+      <w:bookmarkStart w:id="3" w:name="_Toc231484144"/>
       <w:r>
         <w:t>QoDe projesi, yol kenarı veya araç içi kameradan gelen tek video akışını analiz ederek aracın tipini, rengini, plakasını ve kabin içi güvenlik olaylarını FTR sözleşmesine uygun bir JSON çıktısına dönüştüren modüler bir yapay zekâ sistemidir. Sistem; araç, kişi ve nesne adaylarını algılayan YOLO tabanlı katman; sürücü davranışı ve araç tipi için sınıflandırıcı başlıkları; plaka için algılama/OCR/regex doğrulama; renk için baskın renk kümeleme; yolcu konumu ve emniyet kemeri için geometrik/örüntü tabanlı mantık bileşenlerinden oluşur.</w:t>
       </w:r>
@@ -1781,7 +1781,7 @@
       <w:r>
         <w:t xml:space="preserve"> </w:t>
       </w:r>
-      <w:bookmarkEnd w:id="4"/>
+      <w:bookmarkEnd w:id="3"/>
     </w:p>
     <w:p>
       <w:r>
@@ -1809,16 +1809,7 @@
         </w:numPr>
       </w:pPr>
       <w:r>
-        <w:t xml:space="preserve">Araç Tipi ve </w:t>
-      </w:r>
-      <w:r>
-        <w:t>Rengi</w:t>
-      </w:r>
-      <w:r>
-        <w:t xml:space="preserve"> Tanıma: Roboflow Universe üzerinden açık kaynaklı olarak temin edilen; sedan, SUV, hatchback, pickup, minibüs, panelvan ve kamyon görsellerini içeren kırpılmış veri setleri sisteme dahil edilmiştir.</w:t>
-      </w:r>
-      <w:r>
-        <w:t xml:space="preserve"> Renkler için ise K-means metodu ile renk sınıflarına benzerlik oranlarına göre tespit yapılmıştır.</w:t>
+        <w:t>Araç Tipi ve Rengi Tanıma: Roboflow Universe üzerinden açık kaynaklı olarak temin edilen; sedan, SUV, hatchback, pickup, minibüs, panelvan ve kamyon görsellerini içeren kırpılmış veri setleri sisteme dahil edilmiştir. Renkler için ise K-means metodu ile renk sınıflarına benzerlik oranlarına göre tespit yapılmıştır.</w:t>
       </w:r>
     </w:p>
     <w:p>
@@ -1830,19 +1821,7 @@
         </w:numPr>
       </w:pPr>
       <w:r>
-        <w:t xml:space="preserve">Özel Nesne (Teknocan ve Bilgisayar) Eğitimi: Google Görseller'den toplanan "Teknocan" görselleri; araç içi simülasyon teknikleriyle (Motion Blur, Gaussian Blur, Random Brightness Contrast ve Tinted Window/Hue yansımaları) zenginleştirilerek (augmentation) eğitilmiştir. </w:t>
-      </w:r>
-      <w:r>
-        <w:t>B</w:t>
-      </w:r>
-      <w:r>
-        <w:t xml:space="preserve">ilgisayar için ise YOLO'nun hazır veri setinde bulunan varsayılan </w:t>
-      </w:r>
-      <w:r>
-        <w:t xml:space="preserve">laptop </w:t>
-      </w:r>
-      <w:r>
-        <w:t>nesne tespit sınıfı doğrudan entegre edilerek kullanılmıştır.</w:t>
+        <w:t>Özel Nesne (Teknocan ve Bilgisayar) Eğitimi: Google Görseller'den toplanan "Teknocan" görselleri; araç içi simülasyon teknikleriyle (Motion Blur, Gaussian Blur, Random Brightness Contrast ve Tinted Window/Hue yansımaları) zenginleştirilerek (augmentation) eğitilmiştir. Bilgisayar için ise YOLO'nun hazır veri setinde bulunan varsayılan laptop nesne tespit sınıfı doğrudan entegre edilerek kullanılmıştır.</w:t>
       </w:r>
     </w:p>
     <w:p>
@@ -1860,13 +1839,7 @@
     <w:p>
       <w:r>
         <w:lastRenderedPageBreak/>
-        <w:t xml:space="preserve">Oluşturulan her veri kümesi manifest.json veya YAML dosyasıyla kayıt altına alınmış olup, </w:t>
-      </w:r>
-      <w:r>
-        <w:t xml:space="preserve">Rapor </w:t>
-      </w:r>
-      <w:r>
-        <w:t>hedef ailelerine göre veri kapsamları, önişleme katkıları ve eksiklikleri (boşlukları) aşağıdaki tabloda detaylandırılmıştır.</w:t>
+        <w:t>Oluşturulan her veri kümesi manifest.json veya YAML dosyasıyla kayıt altına alınmış olup, Rapor hedef ailelerine göre veri kapsamları, önişleme katkıları ve eksiklikleri (boşlukları) aşağıdaki tabloda detaylandırılmıştır.</w:t>
       </w:r>
     </w:p>
     <w:tbl>
@@ -2186,35 +2159,7 @@
                 <w:rFonts w:cs="Arial"/>
                 <w:szCs w:val="24"/>
               </w:rPr>
-              <w:t xml:space="preserve">zamansal kabin davranışı, </w:t>
-            </w:r>
-            <w:r>
-              <w:rPr>
-                <w:rFonts w:cs="Arial"/>
-                <w:szCs w:val="24"/>
-              </w:rPr>
-              <w:t xml:space="preserve">teelfona bakma, su ime, </w:t>
-            </w:r>
-            <w:r>
-              <w:rPr>
-                <w:rFonts w:cs="Arial"/>
-                <w:szCs w:val="24"/>
-              </w:rPr>
-              <w:t>esneme/yorgunluk</w:t>
-            </w:r>
-            <w:r>
-              <w:rPr>
-                <w:rFonts w:cs="Arial"/>
-                <w:szCs w:val="24"/>
-              </w:rPr>
-              <w:t>, etrafa bakınma</w:t>
-            </w:r>
-            <w:r>
-              <w:rPr>
-                <w:rFonts w:cs="Arial"/>
-                <w:szCs w:val="24"/>
-              </w:rPr>
-              <w:t xml:space="preserve"> ve el-nesne eylemi desteği</w:t>
+              <w:t>zamansal kabin davranışı, teelfona bakma, su ime, esneme/yorgunluk, etrafa bakınma ve el-nesne eylemi desteği</w:t>
             </w:r>
           </w:p>
         </w:tc>
@@ -2485,15 +2430,7 @@
           <w:color w:val="595959"/>
           <w:sz w:val="20"/>
         </w:rPr>
-        <w:t>Tablo</w:t>
-      </w:r>
-      <w:r>
-        <w:rPr>
-          <w:i/>
-          <w:color w:val="595959"/>
-          <w:sz w:val="20"/>
-        </w:rPr>
-        <w:t xml:space="preserve"> 1. </w:t>
+        <w:t xml:space="preserve">Tablo 1. </w:t>
       </w:r>
       <w:r>
         <w:rPr>
@@ -2516,7 +2453,7 @@
       <w:r>
         <w:t>Proje eğitim dizinlerinde araç tipi ve özel nesne başlıkları için sınıf odaklı YAML yapısı vardır. data/custom_dataset.yaml FTR araç tiplerini, plaka, Teknocan, bilgisayar ve yolcu koltuk sınıflarını tek YOLO eğitim sözlüğünde toplar. Teknocan veri seti ayrı bir data.yaml ile teknocan sınıfını taşır; plaka veri seti ise plaka sınıfına odaklanır. Eğitim tarafındaki artırma betikleri, cam yansıması, hareket bulanıklığı ve parlaklık değişimleri gibi FTR videosunda beklenen bozulmaları simüle etmek için tutulmuştur.</w:t>
       </w:r>
-      <w:bookmarkStart w:id="5" w:name="_Toc231484145"/>
+      <w:bookmarkStart w:id="4" w:name="_Toc231484145"/>
     </w:p>
     <w:p/>
     <w:p>
@@ -2538,13 +2475,13 @@
       <w:r>
         <w:t xml:space="preserve"> </w:t>
       </w:r>
-      <w:bookmarkEnd w:id="5"/>
+      <w:bookmarkEnd w:id="4"/>
     </w:p>
     <w:p>
       <w:pPr>
         <w:pStyle w:val="Heading2"/>
       </w:pPr>
-      <w:bookmarkStart w:id="6" w:name="_Toc231484146"/>
+      <w:bookmarkStart w:id="5" w:name="_Toc231484146"/>
       <w:r>
         <w:t>3.1.</w:t>
       </w:r>
@@ -2557,7 +2494,7 @@
       <w:r>
         <w:t xml:space="preserve"> </w:t>
       </w:r>
-      <w:bookmarkEnd w:id="6"/>
+      <w:bookmarkEnd w:id="5"/>
     </w:p>
     <w:p>
       <w:pPr>
@@ -2569,7 +2506,7 @@
           <w:szCs w:val="22"/>
         </w:rPr>
       </w:pPr>
-      <w:bookmarkStart w:id="7" w:name="_Toc231484147"/>
+      <w:bookmarkStart w:id="6" w:name="_Toc231484147"/>
       <w:r>
         <w:rPr>
           <w:rFonts w:ascii="Arial" w:eastAsiaTheme="minorHAnsi" w:hAnsi="Arial" w:cstheme="minorBidi"/>
@@ -2617,7 +2554,7 @@
       <w:r>
         <w:t xml:space="preserve"> </w:t>
       </w:r>
-      <w:bookmarkEnd w:id="7"/>
+      <w:bookmarkEnd w:id="6"/>
     </w:p>
     <w:p>
       <w:pPr>
@@ -2686,7 +2623,7 @@
     </w:p>
     <w:p/>
     <w:p>
-      <w:bookmarkStart w:id="8" w:name="_Toc231484148"/>
+      <w:bookmarkStart w:id="7" w:name="_Toc231484148"/>
       <w:r>
         <w:t>Mimari Docker giriş noktası ile başlar: değerlendirme sırasında video /app/data/input/video.mp4 yolundan okunur ve sonuç /app/data/output/results.json yoluna yazılır. SceneAnalysisEngine, YOLO11x ile araç, kişi, telefon ve bilgisayar adaylarını üretir. Araç kırpımı K-Means renk sınıflandırma, plaka algılama/OCR ve araç tipi sınıflandırıcısına; sürücü/yolcu kırpımı davranış sınıflandırıcısı, yolcu bölge mantığı ve emniyet kemeri sezgisel yöntemine gönderilir. Son aşamada olaylar 3 saniyelik pencereyle tekilleştirilir.</w:t>
       </w:r>
@@ -2775,10 +2712,10 @@
         </w:rPr>
         <w:t xml:space="preserve"> </w:t>
       </w:r>
-      <w:bookmarkEnd w:id="8"/>
+      <w:bookmarkEnd w:id="7"/>
     </w:p>
     <w:p>
-      <w:bookmarkStart w:id="9" w:name="_Toc231484149"/>
+      <w:bookmarkStart w:id="8" w:name="_Toc231484149"/>
       <w:r>
         <w:t>Çalışma zamanı modelleri data/weights/ altında tutulur. Mevcut klasörde sürücü davranış sınıflandırıcısı, araç tipi sınıflandırıcısı, plaka algılayıcı ve Teknocan algılayıcı ağırlıkları bulunmaktadır. Git deposuna büyük ağırlıklar işlenmediği için download_weights.sh ve eğitim betikleri, yerel/Docker kurulumda ağırlık yönetimini tekrar üretilebilir hale getirir.</w:t>
       </w:r>
@@ -3262,10 +3199,10 @@
       <w:r>
         <w:t xml:space="preserve"> </w:t>
       </w:r>
-      <w:bookmarkEnd w:id="9"/>
+      <w:bookmarkEnd w:id="8"/>
     </w:p>
     <w:p>
-      <w:bookmarkStart w:id="10" w:name="_Toc231484150"/>
+      <w:bookmarkStart w:id="9" w:name="_Toc231484150"/>
       <w:r>
         <w:t>Test yaklaşımı dört katmana ayrılmıştır: veri manifest/adaptör kontrolleri, model kanıt artefactleri, FTR şema doğrulaması ve Docker giriş/çıkış sınırı. Bu ayrım, gerçek model performansı ile destek veri kapsamını birbirine karıştırmadan raporlamayı sağlar.</w:t>
       </w:r>
@@ -4107,12 +4044,12 @@
       <w:r>
         <w:t xml:space="preserve">KAYNAKÇA </w:t>
       </w:r>
-      <w:bookmarkStart w:id="11" w:name="_Toc187744794"/>
-      <w:bookmarkStart w:id="12" w:name="_Toc220328442"/>
-      <w:bookmarkEnd w:id="10"/>
+      <w:bookmarkStart w:id="10" w:name="_Toc187744794"/>
+      <w:bookmarkStart w:id="11" w:name="_Toc220328442"/>
+      <w:bookmarkEnd w:id="9"/>
     </w:p>
+    <w:bookmarkEnd w:id="10"/>
     <w:bookmarkEnd w:id="11"/>
-    <w:bookmarkEnd w:id="12"/>
     <w:p>
       <w:pPr>
         <w:pStyle w:val="ListParagraph"/>
@@ -4128,13 +4065,7 @@
         <w:rPr>
           <w:lang w:eastAsia="tr-TR"/>
         </w:rPr>
-        <w:t>Proje ve Yarışma Dokümanları</w:t>
-      </w:r>
-      <w:r>
-        <w:rPr>
-          <w:lang w:eastAsia="tr-TR"/>
-        </w:rPr>
-        <w:t>:</w:t>
+        <w:t>Proje ve Yarışma Dokümanları:</w:t>
       </w:r>
     </w:p>
     <w:p>
@@ -4206,13 +4137,7 @@
         <w:rPr>
           <w:lang w:eastAsia="tr-TR"/>
         </w:rPr>
-        <w:t>Akademik Yayınlar (Makaleler ve Bildiriler)</w:t>
-      </w:r>
-      <w:r>
-        <w:rPr>
-          <w:lang w:eastAsia="tr-TR"/>
-        </w:rPr>
-        <w:t>:</w:t>
+        <w:t>Akademik Yayınlar (Makaleler ve Bildiriler):</w:t>
       </w:r>
     </w:p>
     <w:p>
@@ -4303,13 +4228,7 @@
         <w:rPr>
           <w:lang w:eastAsia="tr-TR"/>
         </w:rPr>
-        <w:t>Veri Setleri</w:t>
-      </w:r>
-      <w:r>
-        <w:rPr>
-          <w:lang w:eastAsia="tr-TR"/>
-        </w:rPr>
-        <w:t>:</w:t>
+        <w:t>Veri Setleri:</w:t>
       </w:r>
     </w:p>
     <w:p>
@@ -4381,13 +4300,7 @@
         <w:rPr>
           <w:lang w:eastAsia="tr-TR"/>
         </w:rPr>
-        <w:t>Yazılım, Kütüphane ve Teknolojik Kaynaklar</w:t>
-      </w:r>
-      <w:r>
-        <w:rPr>
-          <w:lang w:eastAsia="tr-TR"/>
-        </w:rPr>
-        <w:t>:</w:t>
+        <w:t>Yazılım, Kütüphane ve Teknolojik Kaynaklar:</w:t>
       </w:r>
     </w:p>
     <w:p>
@@ -4442,6 +4355,24 @@
           <w:lang w:eastAsia="tr-TR"/>
         </w:rPr>
         <w:t>Vicomtech. (2024). DMD Driver Monitoring Dataset GitHub Repository. Erişim adresi: https://github.com/Vicomtech/DMD-Driver-Monitoring-Dataset (Erişim tarihi: 15.06.2026).</w:t>
+      </w:r>
+    </w:p>
+    <w:p>
+      <w:pPr>
+        <w:pStyle w:val="ListParagraph"/>
+        <w:numPr>
+          <w:ilvl w:val="1"/>
+          <w:numId w:val="31"/>
+        </w:numPr>
+        <w:rPr>
+          <w:lang w:eastAsia="tr-TR"/>
+        </w:rPr>
+      </w:pPr>
+      <w:r>
+        <w:rPr>
+          <w:lang w:eastAsia="tr-TR"/>
+        </w:rPr>
+        <w:t>QoDe Takımı. (2026). QoDe-5G Akıllı Yol Güvenliği Model Deposu. Hugging Face Hub. Erişim adresi: https://huggingface.co/QoDe-5G/qode-models (Erişim tarihi: 15.06.2026).</w:t>
       </w:r>
     </w:p>
     <w:sectPr>
@@ -4751,7 +4682,7 @@
       <w:rPr>
         <w:noProof/>
       </w:rPr>
-      <w:pict w14:anchorId="30789F3B">
+      <w:pict w14:anchorId="522AEF93">
         <v:shapetype id="_x0000_t75" coordsize="21600,21600" o:spt="75" o:preferrelative="t" path="m@4@5l@4@11@9@11@9@5xe" filled="f" stroked="f">
           <v:stroke joinstyle="miter"/>
           <v:formulas>
@@ -9158,29 +9089,29 @@
 </file>
 
 <file path=customXml/item1.xml><?xml version="1.0" encoding="utf-8"?>
+<b:Sources xmlns:b="http://schemas.openxmlformats.org/officeDocument/2006/bibliography" xmlns="http://schemas.openxmlformats.org/officeDocument/2006/bibliography" SelectedStyle="\APASixthEditionOfficeOnline.xsl" StyleName="APA" Version="6"/>
+</file>
+
+<file path=customXml/item2.xml><?xml version="1.0" encoding="utf-8"?>
 <titus xmlns="http://schemas.titus.com/TitusProperties/">
   <TitusGUID xmlns="">eda5a500-f778-49c9-a1b1-156f983f5de1</TitusGUID>
   <TitusMetadata xmlns="">eyJucyI6IlR1cmtjZWxsIiwicHJvcHMiOlt7Im4iOiJUVVJLQ0VMTENMQVNTSUZJQ0FUSU9OIiwidmFscyI6W3sidmFsdWUiOiJLNFBTNE1ESVNJIn1dfSx7Im4iOiJLVktLIiwidmFscyI6W3sidmFsdWUiOiJrdjFjZXJtZTIifV19XX0=</TitusMetadata>
 </titus>
 </file>
 
-<file path=customXml/item2.xml><?xml version="1.0" encoding="utf-8"?>
-<b:Sources xmlns:b="http://schemas.openxmlformats.org/officeDocument/2006/bibliography" xmlns="http://schemas.openxmlformats.org/officeDocument/2006/bibliography" SelectedStyle="\APASixthEditionOfficeOnline.xsl" StyleName="APA" Version="6"/>
+<file path=customXml/itemProps1.xml><?xml version="1.0" encoding="utf-8"?>
+<ds:datastoreItem xmlns:ds="http://schemas.openxmlformats.org/officeDocument/2006/customXml" ds:itemID="{C6801B9A-984D-45F8-88EC-6C7EB5CE02DF}">
+  <ds:schemaRefs>
+    <ds:schemaRef ds:uri="http://schemas.openxmlformats.org/officeDocument/2006/bibliography"/>
+  </ds:schemaRefs>
+</ds:datastoreItem>
 </file>
 
-<file path=customXml/itemProps1.xml><?xml version="1.0" encoding="utf-8"?>
+<file path=customXml/itemProps2.xml><?xml version="1.0" encoding="utf-8"?>
 <ds:datastoreItem xmlns:ds="http://schemas.openxmlformats.org/officeDocument/2006/customXml" ds:itemID="{7ED21365-143C-45B1-9ACB-1599F9359846}">
   <ds:schemaRefs>
     <ds:schemaRef ds:uri="http://schemas.titus.com/TitusProperties/"/>
     <ds:schemaRef ds:uri=""/>
   </ds:schemaRefs>
 </ds:datastoreItem>
-</file>
-
-<file path=customXml/itemProps2.xml><?xml version="1.0" encoding="utf-8"?>
-<ds:datastoreItem xmlns:ds="http://schemas.openxmlformats.org/officeDocument/2006/customXml" ds:itemID="{C6801B9A-984D-45F8-88EC-6C7EB5CE02DF}">
-  <ds:schemaRefs>
-    <ds:schemaRef ds:uri="http://schemas.openxmlformats.org/officeDocument/2006/bibliography"/>
-  </ds:schemaRefs>
-</ds:datastoreItem>
 </file>
</xml_diff>